<commit_message>
Update Database and Backend Mismatch Report.docx
</commit_message>
<xml_diff>
--- a/QA_Documents/Database and Backend Mismatch Report.docx
+++ b/QA_Documents/Database and Backend Mismatch Report.docx
@@ -41,8 +41,69 @@
         <w:jc w:val="center"/>
         <w:rPr>
           <w:rFonts w:ascii="Times New Roman" w:hAnsi="Times New Roman" w:cs="Times New Roman"/>
-          <w:sz w:val="40"/>
-          <w:szCs w:val="40"/>
+        </w:rPr>
+      </w:pPr>
+    </w:p>
+    <w:p>
+      <w:pPr>
+        <w:rPr>
+          <w:rFonts w:ascii="Times New Roman" w:hAnsi="Times New Roman" w:cs="Times New Roman"/>
+        </w:rPr>
+      </w:pPr>
+      <w:r>
+        <w:rPr>
+          <w:rFonts w:ascii="Times New Roman" w:hAnsi="Times New Roman" w:cs="Times New Roman"/>
+        </w:rPr>
+        <w:t xml:space="preserve">Blue </w:t>
+      </w:r>
+      <w:r>
+        <w:rPr>
+          <w:rFonts w:ascii="Times New Roman" w:hAnsi="Times New Roman" w:cs="Times New Roman"/>
+        </w:rPr>
+        <w:t xml:space="preserve">for </w:t>
+      </w:r>
+      <w:r>
+        <w:rPr>
+          <w:rFonts w:ascii="Times New Roman" w:hAnsi="Times New Roman" w:cs="Times New Roman"/>
+        </w:rPr>
+        <w:t>Backend Developer</w:t>
+      </w:r>
+      <w:r>
+        <w:rPr>
+          <w:rFonts w:ascii="Times New Roman" w:hAnsi="Times New Roman" w:cs="Times New Roman"/>
+        </w:rPr>
+        <w:t xml:space="preserve"> </w:t>
+      </w:r>
+    </w:p>
+    <w:p>
+      <w:pPr>
+        <w:rPr>
+          <w:rFonts w:ascii="Times New Roman" w:hAnsi="Times New Roman" w:cs="Times New Roman"/>
+        </w:rPr>
+      </w:pPr>
+      <w:r>
+        <w:rPr>
+          <w:rFonts w:ascii="Times New Roman" w:hAnsi="Times New Roman" w:cs="Times New Roman"/>
+        </w:rPr>
+        <w:t xml:space="preserve">Green </w:t>
+      </w:r>
+      <w:r>
+        <w:rPr>
+          <w:rFonts w:ascii="Times New Roman" w:hAnsi="Times New Roman" w:cs="Times New Roman"/>
+        </w:rPr>
+        <w:t xml:space="preserve">for </w:t>
+      </w:r>
+      <w:r>
+        <w:rPr>
+          <w:rFonts w:ascii="Times New Roman" w:hAnsi="Times New Roman" w:cs="Times New Roman"/>
+        </w:rPr>
+        <w:t>Database Manager</w:t>
+      </w:r>
+    </w:p>
+    <w:p>
+      <w:pPr>
+        <w:rPr>
+          <w:rFonts w:ascii="Times New Roman" w:hAnsi="Times New Roman" w:cs="Times New Roman"/>
         </w:rPr>
       </w:pPr>
     </w:p>
@@ -55,9 +116,9 @@
       <w:tblGrid>
         <w:gridCol w:w="2284"/>
         <w:gridCol w:w="1696"/>
-        <w:gridCol w:w="1484"/>
-        <w:gridCol w:w="1870"/>
-        <w:gridCol w:w="1733"/>
+        <w:gridCol w:w="1478"/>
+        <w:gridCol w:w="1774"/>
+        <w:gridCol w:w="1835"/>
       </w:tblGrid>
       <w:tr>
         <w:tc>
@@ -119,7 +180,7 @@
         </w:tc>
         <w:tc>
           <w:tcPr>
-            <w:tcW w:w="1870" w:type="dxa"/>
+            <w:tcW w:w="1761" w:type="dxa"/>
           </w:tcPr>
           <w:p>
             <w:pPr>
@@ -138,7 +199,7 @@
         </w:tc>
         <w:tc>
           <w:tcPr>
-            <w:tcW w:w="1733" w:type="dxa"/>
+            <w:tcW w:w="1842" w:type="dxa"/>
           </w:tcPr>
           <w:p>
             <w:pPr>
@@ -362,7 +423,8 @@
         </w:tc>
         <w:tc>
           <w:tcPr>
-            <w:tcW w:w="1870" w:type="dxa"/>
+            <w:tcW w:w="1761" w:type="dxa"/>
+            <w:shd w:val="clear" w:color="auto" w:fill="DAE9F7" w:themeFill="text2" w:themeFillTint="1A"/>
           </w:tcPr>
           <w:p>
             <w:pPr>
@@ -414,7 +476,8 @@
         </w:tc>
         <w:tc>
           <w:tcPr>
-            <w:tcW w:w="1733" w:type="dxa"/>
+            <w:tcW w:w="1842" w:type="dxa"/>
+            <w:shd w:val="clear" w:color="auto" w:fill="DAE9F7" w:themeFill="text2" w:themeFillTint="1A"/>
           </w:tcPr>
           <w:p>
             <w:pPr>
@@ -526,7 +589,8 @@
         </w:tc>
         <w:tc>
           <w:tcPr>
-            <w:tcW w:w="1870" w:type="dxa"/>
+            <w:tcW w:w="1761" w:type="dxa"/>
+            <w:shd w:val="clear" w:color="auto" w:fill="DAE9F7" w:themeFill="text2" w:themeFillTint="1A"/>
           </w:tcPr>
           <w:p>
             <w:pPr>
@@ -561,7 +625,8 @@
         </w:tc>
         <w:tc>
           <w:tcPr>
-            <w:tcW w:w="1733" w:type="dxa"/>
+            <w:tcW w:w="1842" w:type="dxa"/>
+            <w:shd w:val="clear" w:color="auto" w:fill="DAE9F7" w:themeFill="text2" w:themeFillTint="1A"/>
           </w:tcPr>
           <w:p>
             <w:pPr>
@@ -681,7 +746,8 @@
         </w:tc>
         <w:tc>
           <w:tcPr>
-            <w:tcW w:w="1870" w:type="dxa"/>
+            <w:tcW w:w="1761" w:type="dxa"/>
+            <w:shd w:val="clear" w:color="auto" w:fill="DAE9F7" w:themeFill="text2" w:themeFillTint="1A"/>
           </w:tcPr>
           <w:p>
             <w:pPr>
@@ -708,19 +774,7 @@
               <w:rPr>
                 <w:rFonts w:ascii="Times New Roman" w:hAnsi="Times New Roman" w:cs="Times New Roman"/>
               </w:rPr>
-              <w:t>‘</w:t>
-            </w:r>
-            <w:r>
-              <w:rPr>
-                <w:rFonts w:ascii="Times New Roman" w:hAnsi="Times New Roman" w:cs="Times New Roman"/>
-              </w:rPr>
-              <w:t>int</w:t>
-            </w:r>
-            <w:r>
-              <w:rPr>
-                <w:rFonts w:ascii="Times New Roman" w:hAnsi="Times New Roman" w:cs="Times New Roman"/>
-              </w:rPr>
-              <w:t>’</w:t>
+              <w:t>Timestamp</w:t>
             </w:r>
             <w:r>
               <w:rPr>
@@ -740,7 +794,8 @@
         </w:tc>
         <w:tc>
           <w:tcPr>
-            <w:tcW w:w="1733" w:type="dxa"/>
+            <w:tcW w:w="1842" w:type="dxa"/>
+            <w:shd w:val="clear" w:color="auto" w:fill="DAE9F7" w:themeFill="text2" w:themeFillTint="1A"/>
           </w:tcPr>
           <w:p>
             <w:pPr>
@@ -775,7 +830,7 @@
               <w:rPr>
                 <w:rFonts w:ascii="Times New Roman" w:hAnsi="Times New Roman" w:cs="Times New Roman"/>
               </w:rPr>
-              <w:t xml:space="preserve">int </w:t>
+              <w:t xml:space="preserve">Timestamp </w:t>
             </w:r>
             <w:r>
               <w:rPr>
@@ -947,7 +1002,8 @@
         </w:tc>
         <w:tc>
           <w:tcPr>
-            <w:tcW w:w="1870" w:type="dxa"/>
+            <w:tcW w:w="1761" w:type="dxa"/>
+            <w:shd w:val="clear" w:color="auto" w:fill="DAE9F7" w:themeFill="text2" w:themeFillTint="1A"/>
           </w:tcPr>
           <w:p>
             <w:pPr>
@@ -982,7 +1038,8 @@
         </w:tc>
         <w:tc>
           <w:tcPr>
-            <w:tcW w:w="1733" w:type="dxa"/>
+            <w:tcW w:w="1842" w:type="dxa"/>
+            <w:shd w:val="clear" w:color="auto" w:fill="DAE9F7" w:themeFill="text2" w:themeFillTint="1A"/>
           </w:tcPr>
           <w:p>
             <w:pPr>
@@ -1183,27 +1240,35 @@
         </w:tc>
         <w:tc>
           <w:tcPr>
-            <w:tcW w:w="1870" w:type="dxa"/>
-          </w:tcPr>
-          <w:p>
-            <w:pPr>
-              <w:rPr>
-                <w:rFonts w:ascii="Times New Roman" w:hAnsi="Times New Roman" w:cs="Times New Roman"/>
-              </w:rPr>
-            </w:pPr>
-          </w:p>
-          <w:p>
-            <w:pPr>
-              <w:jc w:val="center"/>
-              <w:rPr>
-                <w:rFonts w:ascii="Times New Roman" w:hAnsi="Times New Roman" w:cs="Times New Roman"/>
-              </w:rPr>
-            </w:pPr>
-            <w:r>
-              <w:rPr>
-                <w:rFonts w:ascii="Times New Roman" w:hAnsi="Times New Roman" w:cs="Times New Roman"/>
-              </w:rPr>
-              <w:t xml:space="preserve">In database, data type of ‘status’ is tinyint. But in entity class, data type is </w:t>
+            <w:tcW w:w="1761" w:type="dxa"/>
+            <w:shd w:val="clear" w:color="auto" w:fill="D9F2D0" w:themeFill="accent6" w:themeFillTint="33"/>
+          </w:tcPr>
+          <w:p>
+            <w:pPr>
+              <w:rPr>
+                <w:rFonts w:ascii="Times New Roman" w:hAnsi="Times New Roman" w:cs="Times New Roman"/>
+              </w:rPr>
+            </w:pPr>
+          </w:p>
+          <w:p>
+            <w:pPr>
+              <w:jc w:val="center"/>
+              <w:rPr>
+                <w:rFonts w:ascii="Times New Roman" w:hAnsi="Times New Roman" w:cs="Times New Roman"/>
+              </w:rPr>
+            </w:pPr>
+            <w:r>
+              <w:rPr>
+                <w:rFonts w:ascii="Times New Roman" w:hAnsi="Times New Roman" w:cs="Times New Roman"/>
+              </w:rPr>
+              <w:t xml:space="preserve">In database, data type of ‘status’ is tinyint. But in entity class, </w:t>
+            </w:r>
+            <w:r>
+              <w:rPr>
+                <w:rFonts w:ascii="Times New Roman" w:hAnsi="Times New Roman" w:cs="Times New Roman"/>
+              </w:rPr>
+              <w:lastRenderedPageBreak/>
+              <w:t xml:space="preserve">data type is </w:t>
             </w:r>
             <w:r>
               <w:rPr>
@@ -1229,27 +1294,40 @@
         </w:tc>
         <w:tc>
           <w:tcPr>
-            <w:tcW w:w="1733" w:type="dxa"/>
-          </w:tcPr>
-          <w:p>
-            <w:pPr>
-              <w:rPr>
-                <w:rFonts w:ascii="Times New Roman" w:hAnsi="Times New Roman" w:cs="Times New Roman"/>
-              </w:rPr>
-            </w:pPr>
-          </w:p>
-          <w:p>
-            <w:pPr>
-              <w:jc w:val="center"/>
-              <w:rPr>
-                <w:rFonts w:ascii="Times New Roman" w:hAnsi="Times New Roman" w:cs="Times New Roman"/>
-              </w:rPr>
-            </w:pPr>
-            <w:r>
-              <w:rPr>
-                <w:rFonts w:ascii="Times New Roman" w:hAnsi="Times New Roman" w:cs="Times New Roman"/>
-              </w:rPr>
-              <w:t xml:space="preserve">Change data type into </w:t>
+            <w:tcW w:w="1842" w:type="dxa"/>
+            <w:shd w:val="clear" w:color="auto" w:fill="D9F2D0" w:themeFill="accent6" w:themeFillTint="33"/>
+          </w:tcPr>
+          <w:p>
+            <w:pPr>
+              <w:rPr>
+                <w:rFonts w:ascii="Times New Roman" w:hAnsi="Times New Roman" w:cs="Times New Roman"/>
+              </w:rPr>
+            </w:pPr>
+          </w:p>
+          <w:p>
+            <w:pPr>
+              <w:jc w:val="center"/>
+              <w:rPr>
+                <w:rFonts w:ascii="Times New Roman" w:hAnsi="Times New Roman" w:cs="Times New Roman"/>
+              </w:rPr>
+            </w:pPr>
+            <w:r>
+              <w:rPr>
+                <w:rFonts w:ascii="Times New Roman" w:hAnsi="Times New Roman" w:cs="Times New Roman"/>
+              </w:rPr>
+              <w:t xml:space="preserve">Change data type </w:t>
+            </w:r>
+            <w:r>
+              <w:rPr>
+                <w:rFonts w:ascii="Times New Roman" w:hAnsi="Times New Roman" w:cs="Times New Roman"/>
+              </w:rPr>
+              <w:t xml:space="preserve">tinyint </w:t>
+            </w:r>
+            <w:r>
+              <w:rPr>
+                <w:rFonts w:ascii="Times New Roman" w:hAnsi="Times New Roman" w:cs="Times New Roman"/>
+              </w:rPr>
+              <w:t xml:space="preserve">into </w:t>
             </w:r>
             <w:r>
               <w:rPr>
@@ -1267,13 +1345,7 @@
               <w:rPr>
                 <w:rFonts w:ascii="Times New Roman" w:hAnsi="Times New Roman" w:cs="Times New Roman"/>
               </w:rPr>
-              <w:t xml:space="preserve">club </w:t>
-            </w:r>
-            <w:r>
-              <w:rPr>
-                <w:rFonts w:ascii="Times New Roman" w:hAnsi="Times New Roman" w:cs="Times New Roman"/>
-              </w:rPr>
-              <w:t>entity class</w:t>
+              <w:t>clubs table</w:t>
             </w:r>
           </w:p>
         </w:tc>
@@ -1398,13 +1470,20 @@
               <w:rPr>
                 <w:rFonts w:ascii="Times New Roman" w:hAnsi="Times New Roman" w:cs="Times New Roman"/>
               </w:rPr>
-              <w:t xml:space="preserve">Missing attribute </w:t>
-            </w:r>
-          </w:p>
-        </w:tc>
-        <w:tc>
-          <w:tcPr>
-            <w:tcW w:w="1870" w:type="dxa"/>
+              <w:t xml:space="preserve">Missing </w:t>
+            </w:r>
+            <w:r>
+              <w:rPr>
+                <w:rFonts w:ascii="Times New Roman" w:hAnsi="Times New Roman" w:cs="Times New Roman"/>
+              </w:rPr>
+              <w:t>column</w:t>
+            </w:r>
+          </w:p>
+        </w:tc>
+        <w:tc>
+          <w:tcPr>
+            <w:tcW w:w="1761" w:type="dxa"/>
+            <w:shd w:val="clear" w:color="auto" w:fill="D9F2D0" w:themeFill="accent6" w:themeFillTint="33"/>
           </w:tcPr>
           <w:p>
             <w:pPr>
@@ -1444,7 +1523,8 @@
         </w:tc>
         <w:tc>
           <w:tcPr>
-            <w:tcW w:w="1733" w:type="dxa"/>
+            <w:tcW w:w="1842" w:type="dxa"/>
+            <w:shd w:val="clear" w:color="auto" w:fill="D9F2D0" w:themeFill="accent6" w:themeFillTint="33"/>
           </w:tcPr>
           <w:p>
             <w:pPr>
@@ -1531,115 +1611,80 @@
                 <w:rFonts w:ascii="Times New Roman" w:hAnsi="Times New Roman" w:cs="Times New Roman"/>
               </w:rPr>
             </w:pPr>
-          </w:p>
-          <w:p>
-            <w:pPr>
-              <w:jc w:val="center"/>
-              <w:rPr>
-                <w:rFonts w:ascii="Times New Roman" w:hAnsi="Times New Roman" w:cs="Times New Roman"/>
-              </w:rPr>
-            </w:pPr>
-          </w:p>
-          <w:p>
-            <w:pPr>
-              <w:jc w:val="center"/>
-              <w:rPr>
-                <w:rFonts w:ascii="Times New Roman" w:hAnsi="Times New Roman" w:cs="Times New Roman"/>
-              </w:rPr>
-            </w:pPr>
-            <w:r>
-              <w:rPr>
-                <w:rFonts w:ascii="Times New Roman" w:hAnsi="Times New Roman" w:cs="Times New Roman"/>
-              </w:rPr>
-              <w:t xml:space="preserve">Unnessasary attribute </w:t>
-            </w:r>
-          </w:p>
-        </w:tc>
-        <w:tc>
-          <w:tcPr>
-            <w:tcW w:w="1870" w:type="dxa"/>
-          </w:tcPr>
-          <w:p>
-            <w:pPr>
-              <w:jc w:val="center"/>
-              <w:rPr>
-                <w:rFonts w:ascii="Times New Roman" w:hAnsi="Times New Roman" w:cs="Times New Roman"/>
-              </w:rPr>
-            </w:pPr>
-          </w:p>
-          <w:p>
-            <w:pPr>
-              <w:jc w:val="center"/>
-              <w:rPr>
-                <w:rFonts w:ascii="Times New Roman" w:hAnsi="Times New Roman" w:cs="Times New Roman"/>
-              </w:rPr>
-            </w:pPr>
-            <w:r>
-              <w:rPr>
-                <w:rFonts w:ascii="Times New Roman" w:hAnsi="Times New Roman" w:cs="Times New Roman"/>
-              </w:rPr>
-              <w:t>In entity class, there is</w:t>
-            </w:r>
-            <w:r>
-              <w:rPr>
-                <w:rFonts w:ascii="Times New Roman" w:hAnsi="Times New Roman" w:cs="Times New Roman"/>
-              </w:rPr>
-              <w:t xml:space="preserve"> </w:t>
-            </w:r>
-            <w:r>
-              <w:rPr>
-                <w:rFonts w:ascii="Times New Roman" w:hAnsi="Times New Roman" w:cs="Times New Roman"/>
-              </w:rPr>
-              <w:t>‘bus_number’</w:t>
-            </w:r>
-            <w:r>
-              <w:rPr>
-                <w:rFonts w:ascii="Times New Roman" w:hAnsi="Times New Roman" w:cs="Times New Roman"/>
-              </w:rPr>
-              <w:t xml:space="preserve"> attribute which is unnecessary and database doesn’t have.</w:t>
-            </w:r>
-          </w:p>
-          <w:p>
-            <w:pPr>
-              <w:jc w:val="center"/>
-              <w:rPr>
-                <w:rFonts w:ascii="Times New Roman" w:hAnsi="Times New Roman" w:cs="Times New Roman"/>
-              </w:rPr>
-            </w:pPr>
-          </w:p>
-        </w:tc>
-        <w:tc>
-          <w:tcPr>
-            <w:tcW w:w="1733" w:type="dxa"/>
-          </w:tcPr>
-          <w:p>
-            <w:pPr>
-              <w:jc w:val="center"/>
-              <w:rPr>
-                <w:rFonts w:ascii="Times New Roman" w:hAnsi="Times New Roman" w:cs="Times New Roman"/>
-              </w:rPr>
-            </w:pPr>
-          </w:p>
-          <w:p>
-            <w:pPr>
-              <w:jc w:val="center"/>
-              <w:rPr>
-                <w:rFonts w:ascii="Times New Roman" w:hAnsi="Times New Roman" w:cs="Times New Roman"/>
-              </w:rPr>
-            </w:pPr>
-          </w:p>
-          <w:p>
-            <w:pPr>
-              <w:jc w:val="center"/>
-              <w:rPr>
-                <w:rFonts w:ascii="Times New Roman" w:hAnsi="Times New Roman" w:cs="Times New Roman"/>
-              </w:rPr>
-            </w:pPr>
-            <w:r>
-              <w:rPr>
-                <w:rFonts w:ascii="Times New Roman" w:hAnsi="Times New Roman" w:cs="Times New Roman"/>
-              </w:rPr>
-              <w:t>Remove ‘bus_number’ attribute in entity class.</w:t>
+            <w:r>
+              <w:rPr>
+                <w:rFonts w:ascii="Times New Roman" w:hAnsi="Times New Roman" w:cs="Times New Roman"/>
+              </w:rPr>
+              <w:t xml:space="preserve">Missing </w:t>
+            </w:r>
+            <w:r>
+              <w:rPr>
+                <w:rFonts w:ascii="Times New Roman" w:hAnsi="Times New Roman" w:cs="Times New Roman"/>
+              </w:rPr>
+              <w:t>column</w:t>
+            </w:r>
+          </w:p>
+        </w:tc>
+        <w:tc>
+          <w:tcPr>
+            <w:tcW w:w="1761" w:type="dxa"/>
+            <w:shd w:val="clear" w:color="auto" w:fill="D9F2D0" w:themeFill="accent6" w:themeFillTint="33"/>
+          </w:tcPr>
+          <w:p>
+            <w:pPr>
+              <w:jc w:val="center"/>
+              <w:rPr>
+                <w:rFonts w:ascii="Times New Roman" w:hAnsi="Times New Roman" w:cs="Times New Roman"/>
+              </w:rPr>
+            </w:pPr>
+          </w:p>
+          <w:p>
+            <w:pPr>
+              <w:jc w:val="center"/>
+              <w:rPr>
+                <w:rFonts w:ascii="Times New Roman" w:hAnsi="Times New Roman" w:cs="Times New Roman"/>
+              </w:rPr>
+            </w:pPr>
+            <w:r>
+              <w:rPr>
+                <w:rFonts w:ascii="Times New Roman" w:hAnsi="Times New Roman" w:cs="Times New Roman"/>
+              </w:rPr>
+              <w:t>Entity class has a ‘bus_number’ attribute which is missing in bus table.</w:t>
+            </w:r>
+          </w:p>
+          <w:p>
+            <w:pPr>
+              <w:jc w:val="center"/>
+              <w:rPr>
+                <w:rFonts w:ascii="Times New Roman" w:hAnsi="Times New Roman" w:cs="Times New Roman"/>
+              </w:rPr>
+            </w:pPr>
+          </w:p>
+        </w:tc>
+        <w:tc>
+          <w:tcPr>
+            <w:tcW w:w="1842" w:type="dxa"/>
+            <w:shd w:val="clear" w:color="auto" w:fill="D9F2D0" w:themeFill="accent6" w:themeFillTint="33"/>
+          </w:tcPr>
+          <w:p>
+            <w:pPr>
+              <w:rPr>
+                <w:rFonts w:ascii="Times New Roman" w:hAnsi="Times New Roman" w:cs="Times New Roman"/>
+              </w:rPr>
+            </w:pPr>
+          </w:p>
+          <w:p>
+            <w:pPr>
+              <w:jc w:val="center"/>
+              <w:rPr>
+                <w:rFonts w:ascii="Times New Roman" w:hAnsi="Times New Roman" w:cs="Times New Roman"/>
+              </w:rPr>
+            </w:pPr>
+            <w:r>
+              <w:rPr>
+                <w:rFonts w:ascii="Times New Roman" w:hAnsi="Times New Roman" w:cs="Times New Roman"/>
+              </w:rPr>
+              <w:t>Add varchar type ‘bus_number’ column to bus table.</w:t>
             </w:r>
           </w:p>
         </w:tc>
@@ -1713,6 +1758,38 @@
                 <w:rFonts w:ascii="Times New Roman" w:hAnsi="Times New Roman" w:cs="Times New Roman"/>
               </w:rPr>
             </w:pPr>
+          </w:p>
+          <w:p>
+            <w:pPr>
+              <w:jc w:val="center"/>
+              <w:rPr>
+                <w:rFonts w:ascii="Times New Roman" w:hAnsi="Times New Roman" w:cs="Times New Roman"/>
+              </w:rPr>
+            </w:pPr>
+          </w:p>
+          <w:p>
+            <w:pPr>
+              <w:jc w:val="center"/>
+              <w:rPr>
+                <w:rFonts w:ascii="Times New Roman" w:hAnsi="Times New Roman" w:cs="Times New Roman"/>
+              </w:rPr>
+            </w:pPr>
+          </w:p>
+          <w:p>
+            <w:pPr>
+              <w:jc w:val="center"/>
+              <w:rPr>
+                <w:rFonts w:ascii="Times New Roman" w:hAnsi="Times New Roman" w:cs="Times New Roman"/>
+              </w:rPr>
+            </w:pPr>
+          </w:p>
+          <w:p>
+            <w:pPr>
+              <w:jc w:val="center"/>
+              <w:rPr>
+                <w:rFonts w:ascii="Times New Roman" w:hAnsi="Times New Roman" w:cs="Times New Roman"/>
+              </w:rPr>
+            </w:pPr>
             <w:r>
               <w:rPr>
                 <w:rFonts w:ascii="Times New Roman" w:hAnsi="Times New Roman" w:cs="Times New Roman"/>
@@ -1788,6 +1865,38 @@
                 <w:rFonts w:ascii="Times New Roman" w:hAnsi="Times New Roman" w:cs="Times New Roman"/>
               </w:rPr>
             </w:pPr>
+          </w:p>
+          <w:p>
+            <w:pPr>
+              <w:jc w:val="center"/>
+              <w:rPr>
+                <w:rFonts w:ascii="Times New Roman" w:hAnsi="Times New Roman" w:cs="Times New Roman"/>
+              </w:rPr>
+            </w:pPr>
+          </w:p>
+          <w:p>
+            <w:pPr>
+              <w:jc w:val="center"/>
+              <w:rPr>
+                <w:rFonts w:ascii="Times New Roman" w:hAnsi="Times New Roman" w:cs="Times New Roman"/>
+              </w:rPr>
+            </w:pPr>
+          </w:p>
+          <w:p>
+            <w:pPr>
+              <w:jc w:val="center"/>
+              <w:rPr>
+                <w:rFonts w:ascii="Times New Roman" w:hAnsi="Times New Roman" w:cs="Times New Roman"/>
+              </w:rPr>
+            </w:pPr>
+          </w:p>
+          <w:p>
+            <w:pPr>
+              <w:jc w:val="center"/>
+              <w:rPr>
+                <w:rFonts w:ascii="Times New Roman" w:hAnsi="Times New Roman" w:cs="Times New Roman"/>
+              </w:rPr>
+            </w:pPr>
             <w:r>
               <w:rPr>
                 <w:rFonts w:ascii="Times New Roman" w:hAnsi="Times New Roman" w:cs="Times New Roman"/>
@@ -1841,71 +1950,73 @@
         </w:tc>
         <w:tc>
           <w:tcPr>
-            <w:tcW w:w="1870" w:type="dxa"/>
-          </w:tcPr>
-          <w:p>
-            <w:pPr>
-              <w:jc w:val="center"/>
-              <w:rPr>
-                <w:rFonts w:ascii="Times New Roman" w:hAnsi="Times New Roman" w:cs="Times New Roman"/>
-              </w:rPr>
-            </w:pPr>
-          </w:p>
-          <w:p>
-            <w:pPr>
-              <w:jc w:val="center"/>
-              <w:rPr>
-                <w:rFonts w:ascii="Times New Roman" w:hAnsi="Times New Roman" w:cs="Times New Roman"/>
-              </w:rPr>
-            </w:pPr>
-            <w:r>
-              <w:rPr>
-                <w:rFonts w:ascii="Times New Roman" w:hAnsi="Times New Roman" w:cs="Times New Roman"/>
-              </w:rPr>
-              <w:t>In database, data type of ‘event_date’ is date. But in entity class, data type is LocaldateTime</w:t>
-            </w:r>
-          </w:p>
-          <w:p>
-            <w:pPr>
-              <w:jc w:val="center"/>
-              <w:rPr>
-                <w:rFonts w:ascii="Times New Roman" w:hAnsi="Times New Roman" w:cs="Times New Roman"/>
-              </w:rPr>
-            </w:pPr>
-          </w:p>
-        </w:tc>
-        <w:tc>
-          <w:tcPr>
-            <w:tcW w:w="1733" w:type="dxa"/>
-          </w:tcPr>
-          <w:p>
-            <w:pPr>
-              <w:jc w:val="center"/>
-              <w:rPr>
-                <w:rFonts w:ascii="Times New Roman" w:hAnsi="Times New Roman" w:cs="Times New Roman"/>
-              </w:rPr>
-            </w:pPr>
-          </w:p>
-          <w:p>
-            <w:pPr>
-              <w:jc w:val="center"/>
-              <w:rPr>
-                <w:rFonts w:ascii="Times New Roman" w:hAnsi="Times New Roman" w:cs="Times New Roman"/>
-              </w:rPr>
-            </w:pPr>
-          </w:p>
-          <w:p>
-            <w:pPr>
-              <w:jc w:val="center"/>
-              <w:rPr>
-                <w:rFonts w:ascii="Times New Roman" w:hAnsi="Times New Roman" w:cs="Times New Roman"/>
-              </w:rPr>
-            </w:pPr>
-            <w:r>
-              <w:rPr>
-                <w:rFonts w:ascii="Times New Roman" w:hAnsi="Times New Roman" w:cs="Times New Roman"/>
-              </w:rPr>
-              <w:t>Change data type in entity class into LocalDate</w:t>
+            <w:tcW w:w="1761" w:type="dxa"/>
+            <w:shd w:val="clear" w:color="auto" w:fill="DAE9F7" w:themeFill="text2" w:themeFillTint="1A"/>
+          </w:tcPr>
+          <w:p>
+            <w:pPr>
+              <w:jc w:val="center"/>
+              <w:rPr>
+                <w:rFonts w:ascii="Times New Roman" w:hAnsi="Times New Roman" w:cs="Times New Roman"/>
+              </w:rPr>
+            </w:pPr>
+          </w:p>
+          <w:p>
+            <w:pPr>
+              <w:jc w:val="center"/>
+              <w:rPr>
+                <w:rFonts w:ascii="Times New Roman" w:hAnsi="Times New Roman" w:cs="Times New Roman"/>
+              </w:rPr>
+            </w:pPr>
+            <w:r>
+              <w:rPr>
+                <w:rFonts w:ascii="Times New Roman" w:hAnsi="Times New Roman" w:cs="Times New Roman"/>
+              </w:rPr>
+              <w:t>In database, data type of ‘event_date’ is date. But in entity class, data type is LocalDateTime</w:t>
+            </w:r>
+          </w:p>
+          <w:p>
+            <w:pPr>
+              <w:jc w:val="center"/>
+              <w:rPr>
+                <w:rFonts w:ascii="Times New Roman" w:hAnsi="Times New Roman" w:cs="Times New Roman"/>
+              </w:rPr>
+            </w:pPr>
+          </w:p>
+        </w:tc>
+        <w:tc>
+          <w:tcPr>
+            <w:tcW w:w="1842" w:type="dxa"/>
+            <w:shd w:val="clear" w:color="auto" w:fill="DAE9F7" w:themeFill="text2" w:themeFillTint="1A"/>
+          </w:tcPr>
+          <w:p>
+            <w:pPr>
+              <w:jc w:val="center"/>
+              <w:rPr>
+                <w:rFonts w:ascii="Times New Roman" w:hAnsi="Times New Roman" w:cs="Times New Roman"/>
+              </w:rPr>
+            </w:pPr>
+          </w:p>
+          <w:p>
+            <w:pPr>
+              <w:jc w:val="center"/>
+              <w:rPr>
+                <w:rFonts w:ascii="Times New Roman" w:hAnsi="Times New Roman" w:cs="Times New Roman"/>
+              </w:rPr>
+            </w:pPr>
+          </w:p>
+          <w:p>
+            <w:pPr>
+              <w:jc w:val="center"/>
+              <w:rPr>
+                <w:rFonts w:ascii="Times New Roman" w:hAnsi="Times New Roman" w:cs="Times New Roman"/>
+              </w:rPr>
+            </w:pPr>
+            <w:r>
+              <w:rPr>
+                <w:rFonts w:ascii="Times New Roman" w:hAnsi="Times New Roman" w:cs="Times New Roman"/>
+              </w:rPr>
+              <w:t>Change data type in event entity class into LocalDate</w:t>
             </w:r>
           </w:p>
         </w:tc>
@@ -1942,7 +2053,40 @@
         <w:tc>
           <w:tcPr>
             <w:tcW w:w="1484" w:type="dxa"/>
-          </w:tcPr>
+            <w:vMerge w:val="restart"/>
+          </w:tcPr>
+          <w:p>
+            <w:pPr>
+              <w:jc w:val="center"/>
+              <w:rPr>
+                <w:rFonts w:ascii="Times New Roman" w:hAnsi="Times New Roman" w:cs="Times New Roman"/>
+              </w:rPr>
+            </w:pPr>
+          </w:p>
+          <w:p>
+            <w:pPr>
+              <w:jc w:val="center"/>
+              <w:rPr>
+                <w:rFonts w:ascii="Times New Roman" w:hAnsi="Times New Roman" w:cs="Times New Roman"/>
+              </w:rPr>
+            </w:pPr>
+          </w:p>
+          <w:p>
+            <w:pPr>
+              <w:jc w:val="center"/>
+              <w:rPr>
+                <w:rFonts w:ascii="Times New Roman" w:hAnsi="Times New Roman" w:cs="Times New Roman"/>
+              </w:rPr>
+            </w:pPr>
+          </w:p>
+          <w:p>
+            <w:pPr>
+              <w:jc w:val="center"/>
+              <w:rPr>
+                <w:rFonts w:ascii="Times New Roman" w:hAnsi="Times New Roman" w:cs="Times New Roman"/>
+              </w:rPr>
+            </w:pPr>
+          </w:p>
           <w:p>
             <w:pPr>
               <w:jc w:val="center"/>
@@ -1976,63 +2120,65 @@
         </w:tc>
         <w:tc>
           <w:tcPr>
-            <w:tcW w:w="1870" w:type="dxa"/>
-          </w:tcPr>
-          <w:p>
-            <w:pPr>
-              <w:jc w:val="center"/>
-              <w:rPr>
-                <w:rFonts w:ascii="Times New Roman" w:hAnsi="Times New Roman" w:cs="Times New Roman"/>
-              </w:rPr>
-            </w:pPr>
-          </w:p>
-          <w:p>
-            <w:pPr>
-              <w:jc w:val="center"/>
-              <w:rPr>
-                <w:rFonts w:ascii="Times New Roman" w:hAnsi="Times New Roman" w:cs="Times New Roman"/>
-              </w:rPr>
-            </w:pPr>
-            <w:r>
-              <w:rPr>
-                <w:rFonts w:ascii="Times New Roman" w:hAnsi="Times New Roman" w:cs="Times New Roman"/>
-              </w:rPr>
-              <w:t>There should be a separate column and attribute to store event time separately</w:t>
-            </w:r>
-          </w:p>
-          <w:p>
-            <w:pPr>
-              <w:jc w:val="center"/>
-              <w:rPr>
-                <w:rFonts w:ascii="Times New Roman" w:hAnsi="Times New Roman" w:cs="Times New Roman"/>
-              </w:rPr>
-            </w:pPr>
-          </w:p>
-        </w:tc>
-        <w:tc>
-          <w:tcPr>
-            <w:tcW w:w="1733" w:type="dxa"/>
-          </w:tcPr>
-          <w:p>
-            <w:pPr>
-              <w:jc w:val="center"/>
-              <w:rPr>
-                <w:rFonts w:ascii="Times New Roman" w:hAnsi="Times New Roman" w:cs="Times New Roman"/>
-              </w:rPr>
-            </w:pPr>
-          </w:p>
-          <w:p>
-            <w:pPr>
-              <w:jc w:val="center"/>
-              <w:rPr>
-                <w:rFonts w:ascii="Times New Roman" w:hAnsi="Times New Roman" w:cs="Times New Roman"/>
-              </w:rPr>
-            </w:pPr>
-            <w:r>
-              <w:rPr>
-                <w:rFonts w:ascii="Times New Roman" w:hAnsi="Times New Roman" w:cs="Times New Roman"/>
-              </w:rPr>
-              <w:t xml:space="preserve">Create a new column and attribute as ‘event_time’ </w:t>
+            <w:tcW w:w="1761" w:type="dxa"/>
+            <w:shd w:val="clear" w:color="auto" w:fill="D9F2D0" w:themeFill="accent6" w:themeFillTint="33"/>
+          </w:tcPr>
+          <w:p>
+            <w:pPr>
+              <w:jc w:val="center"/>
+              <w:rPr>
+                <w:rFonts w:ascii="Times New Roman" w:hAnsi="Times New Roman" w:cs="Times New Roman"/>
+              </w:rPr>
+            </w:pPr>
+          </w:p>
+          <w:p>
+            <w:pPr>
+              <w:jc w:val="center"/>
+              <w:rPr>
+                <w:rFonts w:ascii="Times New Roman" w:hAnsi="Times New Roman" w:cs="Times New Roman"/>
+              </w:rPr>
+            </w:pPr>
+            <w:r>
+              <w:rPr>
+                <w:rFonts w:ascii="Times New Roman" w:hAnsi="Times New Roman" w:cs="Times New Roman"/>
+              </w:rPr>
+              <w:t>There should be a separate column to store ‘event_time’ separately</w:t>
+            </w:r>
+          </w:p>
+          <w:p>
+            <w:pPr>
+              <w:jc w:val="center"/>
+              <w:rPr>
+                <w:rFonts w:ascii="Times New Roman" w:hAnsi="Times New Roman" w:cs="Times New Roman"/>
+              </w:rPr>
+            </w:pPr>
+          </w:p>
+        </w:tc>
+        <w:tc>
+          <w:tcPr>
+            <w:tcW w:w="1842" w:type="dxa"/>
+            <w:shd w:val="clear" w:color="auto" w:fill="D9F2D0" w:themeFill="accent6" w:themeFillTint="33"/>
+          </w:tcPr>
+          <w:p>
+            <w:pPr>
+              <w:jc w:val="center"/>
+              <w:rPr>
+                <w:rFonts w:ascii="Times New Roman" w:hAnsi="Times New Roman" w:cs="Times New Roman"/>
+              </w:rPr>
+            </w:pPr>
+          </w:p>
+          <w:p>
+            <w:pPr>
+              <w:jc w:val="center"/>
+              <w:rPr>
+                <w:rFonts w:ascii="Times New Roman" w:hAnsi="Times New Roman" w:cs="Times New Roman"/>
+              </w:rPr>
+            </w:pPr>
+            <w:r>
+              <w:rPr>
+                <w:rFonts w:ascii="Times New Roman" w:hAnsi="Times New Roman" w:cs="Times New Roman"/>
+              </w:rPr>
+              <w:t>Create a new column as ‘event_time’ with Time data type</w:t>
             </w:r>
           </w:p>
         </w:tc>
@@ -2041,88 +2187,22 @@
         <w:tc>
           <w:tcPr>
             <w:tcW w:w="2284" w:type="dxa"/>
-          </w:tcPr>
-          <w:p>
-            <w:pPr>
-              <w:jc w:val="center"/>
-              <w:rPr>
-                <w:rFonts w:ascii="Times New Roman" w:hAnsi="Times New Roman" w:cs="Times New Roman"/>
-              </w:rPr>
-            </w:pPr>
-          </w:p>
-          <w:p>
-            <w:pPr>
-              <w:jc w:val="center"/>
-              <w:rPr>
-                <w:rFonts w:ascii="Times New Roman" w:hAnsi="Times New Roman" w:cs="Times New Roman"/>
-              </w:rPr>
-            </w:pPr>
-          </w:p>
-          <w:p>
-            <w:pPr>
-              <w:jc w:val="center"/>
-              <w:rPr>
-                <w:rFonts w:ascii="Times New Roman" w:hAnsi="Times New Roman" w:cs="Times New Roman"/>
-              </w:rPr>
-            </w:pPr>
-          </w:p>
-          <w:p>
-            <w:pPr>
-              <w:jc w:val="center"/>
-              <w:rPr>
-                <w:rFonts w:ascii="Times New Roman" w:hAnsi="Times New Roman" w:cs="Times New Roman"/>
-              </w:rPr>
-            </w:pPr>
-            <w:r>
-              <w:rPr>
-                <w:rFonts w:ascii="Times New Roman" w:hAnsi="Times New Roman" w:cs="Times New Roman"/>
-              </w:rPr>
-              <w:t>CheckInEntity</w:t>
-            </w:r>
+            <w:vMerge/>
+          </w:tcPr>
+          <w:p>
+            <w:pPr>
+              <w:jc w:val="center"/>
+              <w:rPr>
+                <w:rFonts w:ascii="Times New Roman" w:hAnsi="Times New Roman" w:cs="Times New Roman"/>
+              </w:rPr>
+            </w:pPr>
           </w:p>
         </w:tc>
         <w:tc>
           <w:tcPr>
             <w:tcW w:w="1696" w:type="dxa"/>
-          </w:tcPr>
-          <w:p>
-            <w:pPr>
-              <w:jc w:val="center"/>
-              <w:rPr>
-                <w:rFonts w:ascii="Times New Roman" w:hAnsi="Times New Roman" w:cs="Times New Roman"/>
-              </w:rPr>
-            </w:pPr>
-          </w:p>
-          <w:p>
-            <w:pPr>
-              <w:jc w:val="center"/>
-              <w:rPr>
-                <w:rFonts w:ascii="Times New Roman" w:hAnsi="Times New Roman" w:cs="Times New Roman"/>
-              </w:rPr>
-            </w:pPr>
-          </w:p>
-          <w:p>
-            <w:pPr>
-              <w:jc w:val="center"/>
-              <w:rPr>
-                <w:rFonts w:ascii="Times New Roman" w:hAnsi="Times New Roman" w:cs="Times New Roman"/>
-              </w:rPr>
-            </w:pPr>
-          </w:p>
-          <w:p>
-            <w:pPr>
-              <w:jc w:val="center"/>
-              <w:rPr>
-                <w:rFonts w:ascii="Times New Roman" w:hAnsi="Times New Roman" w:cs="Times New Roman"/>
-              </w:rPr>
-            </w:pPr>
-            <w:r>
-              <w:rPr>
-                <w:rFonts w:ascii="Times New Roman" w:hAnsi="Times New Roman" w:cs="Times New Roman"/>
-              </w:rPr>
-              <w:t>check_in</w:t>
-            </w:r>
-          </w:p>
+            <w:vMerge/>
+          </w:tcPr>
           <w:p>
             <w:pPr>
               <w:jc w:val="center"/>
@@ -2135,118 +2215,139 @@
         <w:tc>
           <w:tcPr>
             <w:tcW w:w="1484" w:type="dxa"/>
-          </w:tcPr>
-          <w:p>
-            <w:pPr>
-              <w:jc w:val="center"/>
-              <w:rPr>
-                <w:rFonts w:ascii="Times New Roman" w:hAnsi="Times New Roman" w:cs="Times New Roman"/>
-              </w:rPr>
-            </w:pPr>
-          </w:p>
-          <w:p>
-            <w:pPr>
-              <w:jc w:val="center"/>
-              <w:rPr>
-                <w:rFonts w:ascii="Times New Roman" w:hAnsi="Times New Roman" w:cs="Times New Roman"/>
-              </w:rPr>
-            </w:pPr>
-          </w:p>
-          <w:p>
-            <w:pPr>
-              <w:jc w:val="center"/>
-              <w:rPr>
-                <w:rFonts w:ascii="Times New Roman" w:hAnsi="Times New Roman" w:cs="Times New Roman"/>
-              </w:rPr>
-            </w:pPr>
-          </w:p>
-          <w:p>
-            <w:pPr>
-              <w:jc w:val="center"/>
-              <w:rPr>
-                <w:rFonts w:ascii="Times New Roman" w:hAnsi="Times New Roman" w:cs="Times New Roman"/>
-              </w:rPr>
-            </w:pPr>
-            <w:r>
-              <w:rPr>
-                <w:rFonts w:ascii="Times New Roman" w:hAnsi="Times New Roman" w:cs="Times New Roman"/>
-              </w:rPr>
-              <w:t>Table name mismatch</w:t>
-            </w:r>
-          </w:p>
-        </w:tc>
-        <w:tc>
-          <w:tcPr>
-            <w:tcW w:w="1870" w:type="dxa"/>
-          </w:tcPr>
-          <w:p>
-            <w:pPr>
-              <w:jc w:val="center"/>
-              <w:rPr>
-                <w:rFonts w:ascii="Times New Roman" w:hAnsi="Times New Roman" w:cs="Times New Roman"/>
-              </w:rPr>
-            </w:pPr>
-          </w:p>
-          <w:p>
-            <w:pPr>
-              <w:jc w:val="center"/>
-              <w:rPr>
-                <w:rFonts w:ascii="Times New Roman" w:hAnsi="Times New Roman" w:cs="Times New Roman"/>
-              </w:rPr>
-            </w:pPr>
-            <w:r>
-              <w:rPr>
-                <w:rFonts w:ascii="Times New Roman" w:hAnsi="Times New Roman" w:cs="Times New Roman"/>
-              </w:rPr>
-              <w:t>In database, table name is ‘check_in’. But in entity class, it’s ‘check_In’.</w:t>
-            </w:r>
-          </w:p>
-          <w:p>
-            <w:pPr>
-              <w:jc w:val="center"/>
-              <w:rPr>
-                <w:rFonts w:ascii="Times New Roman" w:hAnsi="Times New Roman" w:cs="Times New Roman"/>
-              </w:rPr>
-            </w:pPr>
-          </w:p>
-        </w:tc>
-        <w:tc>
-          <w:tcPr>
-            <w:tcW w:w="1733" w:type="dxa"/>
-          </w:tcPr>
-          <w:p>
-            <w:pPr>
-              <w:jc w:val="center"/>
-              <w:rPr>
-                <w:rFonts w:ascii="Times New Roman" w:hAnsi="Times New Roman" w:cs="Times New Roman"/>
-              </w:rPr>
-            </w:pPr>
-          </w:p>
-          <w:p>
-            <w:pPr>
-              <w:jc w:val="center"/>
-              <w:rPr>
-                <w:rFonts w:ascii="Times New Roman" w:hAnsi="Times New Roman" w:cs="Times New Roman"/>
-              </w:rPr>
-            </w:pPr>
-            <w:r>
-              <w:rPr>
-                <w:rFonts w:ascii="Times New Roman" w:hAnsi="Times New Roman" w:cs="Times New Roman"/>
-              </w:rPr>
-              <w:t xml:space="preserve">Change table name in </w:t>
-            </w:r>
-            <w:r>
-              <w:rPr>
-                <w:rFonts w:ascii="Times New Roman" w:hAnsi="Times New Roman" w:cs="Times New Roman"/>
-              </w:rPr>
-              <w:t xml:space="preserve">checkin </w:t>
-            </w:r>
-            <w:r>
-              <w:rPr>
-                <w:rFonts w:ascii="Times New Roman" w:hAnsi="Times New Roman" w:cs="Times New Roman"/>
-              </w:rPr>
-              <w:t>entity class into ‘check_in’</w:t>
-            </w:r>
+            <w:vMerge/>
+          </w:tcPr>
+          <w:p>
+            <w:pPr>
+              <w:jc w:val="center"/>
+              <w:rPr>
+                <w:rFonts w:ascii="Times New Roman" w:hAnsi="Times New Roman" w:cs="Times New Roman"/>
+              </w:rPr>
+            </w:pPr>
+          </w:p>
+        </w:tc>
+        <w:tc>
+          <w:tcPr>
+            <w:tcW w:w="1761" w:type="dxa"/>
+            <w:shd w:val="clear" w:color="auto" w:fill="DAE9F7" w:themeFill="text2" w:themeFillTint="1A"/>
+          </w:tcPr>
+          <w:p>
+            <w:pPr>
+              <w:jc w:val="center"/>
+              <w:rPr>
+                <w:rFonts w:ascii="Times New Roman" w:hAnsi="Times New Roman" w:cs="Times New Roman"/>
+              </w:rPr>
+            </w:pPr>
+          </w:p>
+          <w:p>
+            <w:pPr>
+              <w:jc w:val="center"/>
+              <w:rPr>
+                <w:rFonts w:ascii="Times New Roman" w:hAnsi="Times New Roman" w:cs="Times New Roman"/>
+              </w:rPr>
+            </w:pPr>
+          </w:p>
+          <w:p>
+            <w:pPr>
+              <w:jc w:val="center"/>
+              <w:rPr>
+                <w:rFonts w:ascii="Times New Roman" w:hAnsi="Times New Roman" w:cs="Times New Roman"/>
+              </w:rPr>
+            </w:pPr>
+            <w:r>
+              <w:rPr>
+                <w:rFonts w:ascii="Times New Roman" w:hAnsi="Times New Roman" w:cs="Times New Roman"/>
+              </w:rPr>
+              <w:t xml:space="preserve">There should be a separate attribute to store </w:t>
+            </w:r>
+            <w:r>
+              <w:rPr>
+                <w:rFonts w:ascii="Times New Roman" w:hAnsi="Times New Roman" w:cs="Times New Roman"/>
+              </w:rPr>
+              <w:t>‘</w:t>
+            </w:r>
+            <w:r>
+              <w:rPr>
+                <w:rFonts w:ascii="Times New Roman" w:hAnsi="Times New Roman" w:cs="Times New Roman"/>
+              </w:rPr>
+              <w:t>event</w:t>
+            </w:r>
+            <w:r>
+              <w:rPr>
+                <w:rFonts w:ascii="Times New Roman" w:hAnsi="Times New Roman" w:cs="Times New Roman"/>
+              </w:rPr>
+              <w:t>_</w:t>
+            </w:r>
+            <w:r>
+              <w:rPr>
+                <w:rFonts w:ascii="Times New Roman" w:hAnsi="Times New Roman" w:cs="Times New Roman"/>
+              </w:rPr>
+              <w:t>time</w:t>
+            </w:r>
+            <w:r>
+              <w:rPr>
+                <w:rFonts w:ascii="Times New Roman" w:hAnsi="Times New Roman" w:cs="Times New Roman"/>
+              </w:rPr>
+              <w:t>’</w:t>
+            </w:r>
+          </w:p>
+          <w:p>
+            <w:pPr>
+              <w:jc w:val="center"/>
+              <w:rPr>
+                <w:rFonts w:ascii="Times New Roman" w:hAnsi="Times New Roman" w:cs="Times New Roman"/>
+              </w:rPr>
+            </w:pPr>
+            <w:r>
+              <w:rPr>
+                <w:rFonts w:ascii="Times New Roman" w:hAnsi="Times New Roman" w:cs="Times New Roman"/>
+              </w:rPr>
+              <w:t>separately</w:t>
+            </w:r>
+          </w:p>
+          <w:p>
+            <w:pPr>
+              <w:jc w:val="center"/>
+              <w:rPr>
+                <w:rFonts w:ascii="Times New Roman" w:hAnsi="Times New Roman" w:cs="Times New Roman"/>
+              </w:rPr>
+            </w:pPr>
+          </w:p>
+        </w:tc>
+        <w:tc>
+          <w:tcPr>
+            <w:tcW w:w="1842" w:type="dxa"/>
+            <w:shd w:val="clear" w:color="auto" w:fill="DAE9F7" w:themeFill="text2" w:themeFillTint="1A"/>
+          </w:tcPr>
+          <w:p>
+            <w:pPr>
+              <w:jc w:val="center"/>
+              <w:rPr>
+                <w:rFonts w:ascii="Times New Roman" w:hAnsi="Times New Roman" w:cs="Times New Roman"/>
+              </w:rPr>
+            </w:pPr>
+          </w:p>
+          <w:p>
+            <w:pPr>
+              <w:jc w:val="center"/>
+              <w:rPr>
+                <w:rFonts w:ascii="Times New Roman" w:hAnsi="Times New Roman" w:cs="Times New Roman"/>
+              </w:rPr>
+            </w:pPr>
+            <w:r>
+              <w:rPr>
+                <w:rFonts w:ascii="Times New Roman" w:hAnsi="Times New Roman" w:cs="Times New Roman"/>
+              </w:rPr>
+              <w:t>Create a new attribute as event_time with LocalTime data type in event entity class</w:t>
+            </w:r>
+          </w:p>
+          <w:p>
+            <w:pPr>
+              <w:jc w:val="center"/>
+              <w:rPr>
+                <w:rFonts w:ascii="Times New Roman" w:hAnsi="Times New Roman" w:cs="Times New Roman"/>
+              </w:rPr>
+            </w:pPr>
           </w:p>
         </w:tc>
       </w:tr>
@@ -2254,6 +2355,221 @@
         <w:tc>
           <w:tcPr>
             <w:tcW w:w="2284" w:type="dxa"/>
+          </w:tcPr>
+          <w:p>
+            <w:pPr>
+              <w:jc w:val="center"/>
+              <w:rPr>
+                <w:rFonts w:ascii="Times New Roman" w:hAnsi="Times New Roman" w:cs="Times New Roman"/>
+              </w:rPr>
+            </w:pPr>
+          </w:p>
+          <w:p>
+            <w:pPr>
+              <w:jc w:val="center"/>
+              <w:rPr>
+                <w:rFonts w:ascii="Times New Roman" w:hAnsi="Times New Roman" w:cs="Times New Roman"/>
+              </w:rPr>
+            </w:pPr>
+          </w:p>
+          <w:p>
+            <w:pPr>
+              <w:jc w:val="center"/>
+              <w:rPr>
+                <w:rFonts w:ascii="Times New Roman" w:hAnsi="Times New Roman" w:cs="Times New Roman"/>
+              </w:rPr>
+            </w:pPr>
+          </w:p>
+          <w:p>
+            <w:pPr>
+              <w:jc w:val="center"/>
+              <w:rPr>
+                <w:rFonts w:ascii="Times New Roman" w:hAnsi="Times New Roman" w:cs="Times New Roman"/>
+              </w:rPr>
+            </w:pPr>
+            <w:r>
+              <w:rPr>
+                <w:rFonts w:ascii="Times New Roman" w:hAnsi="Times New Roman" w:cs="Times New Roman"/>
+              </w:rPr>
+              <w:t>CheckInEntity</w:t>
+            </w:r>
+          </w:p>
+        </w:tc>
+        <w:tc>
+          <w:tcPr>
+            <w:tcW w:w="1696" w:type="dxa"/>
+          </w:tcPr>
+          <w:p>
+            <w:pPr>
+              <w:jc w:val="center"/>
+              <w:rPr>
+                <w:rFonts w:ascii="Times New Roman" w:hAnsi="Times New Roman" w:cs="Times New Roman"/>
+              </w:rPr>
+            </w:pPr>
+          </w:p>
+          <w:p>
+            <w:pPr>
+              <w:jc w:val="center"/>
+              <w:rPr>
+                <w:rFonts w:ascii="Times New Roman" w:hAnsi="Times New Roman" w:cs="Times New Roman"/>
+              </w:rPr>
+            </w:pPr>
+          </w:p>
+          <w:p>
+            <w:pPr>
+              <w:jc w:val="center"/>
+              <w:rPr>
+                <w:rFonts w:ascii="Times New Roman" w:hAnsi="Times New Roman" w:cs="Times New Roman"/>
+              </w:rPr>
+            </w:pPr>
+          </w:p>
+          <w:p>
+            <w:pPr>
+              <w:jc w:val="center"/>
+              <w:rPr>
+                <w:rFonts w:ascii="Times New Roman" w:hAnsi="Times New Roman" w:cs="Times New Roman"/>
+              </w:rPr>
+            </w:pPr>
+            <w:r>
+              <w:rPr>
+                <w:rFonts w:ascii="Times New Roman" w:hAnsi="Times New Roman" w:cs="Times New Roman"/>
+              </w:rPr>
+              <w:t>check_in</w:t>
+            </w:r>
+          </w:p>
+          <w:p>
+            <w:pPr>
+              <w:jc w:val="center"/>
+              <w:rPr>
+                <w:rFonts w:ascii="Times New Roman" w:hAnsi="Times New Roman" w:cs="Times New Roman"/>
+              </w:rPr>
+            </w:pPr>
+          </w:p>
+        </w:tc>
+        <w:tc>
+          <w:tcPr>
+            <w:tcW w:w="1484" w:type="dxa"/>
+          </w:tcPr>
+          <w:p>
+            <w:pPr>
+              <w:jc w:val="center"/>
+              <w:rPr>
+                <w:rFonts w:ascii="Times New Roman" w:hAnsi="Times New Roman" w:cs="Times New Roman"/>
+              </w:rPr>
+            </w:pPr>
+          </w:p>
+          <w:p>
+            <w:pPr>
+              <w:jc w:val="center"/>
+              <w:rPr>
+                <w:rFonts w:ascii="Times New Roman" w:hAnsi="Times New Roman" w:cs="Times New Roman"/>
+              </w:rPr>
+            </w:pPr>
+          </w:p>
+          <w:p>
+            <w:pPr>
+              <w:jc w:val="center"/>
+              <w:rPr>
+                <w:rFonts w:ascii="Times New Roman" w:hAnsi="Times New Roman" w:cs="Times New Roman"/>
+              </w:rPr>
+            </w:pPr>
+          </w:p>
+          <w:p>
+            <w:pPr>
+              <w:jc w:val="center"/>
+              <w:rPr>
+                <w:rFonts w:ascii="Times New Roman" w:hAnsi="Times New Roman" w:cs="Times New Roman"/>
+              </w:rPr>
+            </w:pPr>
+            <w:r>
+              <w:rPr>
+                <w:rFonts w:ascii="Times New Roman" w:hAnsi="Times New Roman" w:cs="Times New Roman"/>
+              </w:rPr>
+              <w:t>Table name mismatch</w:t>
+            </w:r>
+          </w:p>
+        </w:tc>
+        <w:tc>
+          <w:tcPr>
+            <w:tcW w:w="1761" w:type="dxa"/>
+            <w:shd w:val="clear" w:color="auto" w:fill="DAE9F7" w:themeFill="text2" w:themeFillTint="1A"/>
+          </w:tcPr>
+          <w:p>
+            <w:pPr>
+              <w:jc w:val="center"/>
+              <w:rPr>
+                <w:rFonts w:ascii="Times New Roman" w:hAnsi="Times New Roman" w:cs="Times New Roman"/>
+              </w:rPr>
+            </w:pPr>
+          </w:p>
+          <w:p>
+            <w:pPr>
+              <w:jc w:val="center"/>
+              <w:rPr>
+                <w:rFonts w:ascii="Times New Roman" w:hAnsi="Times New Roman" w:cs="Times New Roman"/>
+              </w:rPr>
+            </w:pPr>
+            <w:r>
+              <w:rPr>
+                <w:rFonts w:ascii="Times New Roman" w:hAnsi="Times New Roman" w:cs="Times New Roman"/>
+              </w:rPr>
+              <w:t>In database, table name is ‘check_in’. But in entity class, it’s ‘check_In’.</w:t>
+            </w:r>
+          </w:p>
+          <w:p>
+            <w:pPr>
+              <w:jc w:val="center"/>
+              <w:rPr>
+                <w:rFonts w:ascii="Times New Roman" w:hAnsi="Times New Roman" w:cs="Times New Roman"/>
+              </w:rPr>
+            </w:pPr>
+          </w:p>
+        </w:tc>
+        <w:tc>
+          <w:tcPr>
+            <w:tcW w:w="1842" w:type="dxa"/>
+            <w:shd w:val="clear" w:color="auto" w:fill="DAE9F7" w:themeFill="text2" w:themeFillTint="1A"/>
+          </w:tcPr>
+          <w:p>
+            <w:pPr>
+              <w:jc w:val="center"/>
+              <w:rPr>
+                <w:rFonts w:ascii="Times New Roman" w:hAnsi="Times New Roman" w:cs="Times New Roman"/>
+              </w:rPr>
+            </w:pPr>
+          </w:p>
+          <w:p>
+            <w:pPr>
+              <w:jc w:val="center"/>
+              <w:rPr>
+                <w:rFonts w:ascii="Times New Roman" w:hAnsi="Times New Roman" w:cs="Times New Roman"/>
+              </w:rPr>
+            </w:pPr>
+            <w:r>
+              <w:rPr>
+                <w:rFonts w:ascii="Times New Roman" w:hAnsi="Times New Roman" w:cs="Times New Roman"/>
+              </w:rPr>
+              <w:t xml:space="preserve">Change table name in </w:t>
+            </w:r>
+            <w:r>
+              <w:rPr>
+                <w:rFonts w:ascii="Times New Roman" w:hAnsi="Times New Roman" w:cs="Times New Roman"/>
+              </w:rPr>
+              <w:t xml:space="preserve">checkin </w:t>
+            </w:r>
+            <w:r>
+              <w:rPr>
+                <w:rFonts w:ascii="Times New Roman" w:hAnsi="Times New Roman" w:cs="Times New Roman"/>
+              </w:rPr>
+              <w:t>entity class into ‘check_in’</w:t>
+            </w:r>
+          </w:p>
+        </w:tc>
+      </w:tr>
+      <w:tr>
+        <w:tc>
+          <w:tcPr>
+            <w:tcW w:w="2284" w:type="dxa"/>
             <w:vMerge w:val="restart"/>
           </w:tcPr>
           <w:p>
@@ -2283,7 +2599,19 @@
               <w:rPr>
                 <w:rFonts w:ascii="Times New Roman" w:hAnsi="Times New Roman" w:cs="Times New Roman"/>
               </w:rPr>
-              <w:t>StaffEntty</w:t>
+              <w:t>StaffEnt</w:t>
+            </w:r>
+            <w:r>
+              <w:rPr>
+                <w:rFonts w:ascii="Times New Roman" w:hAnsi="Times New Roman" w:cs="Times New Roman"/>
+              </w:rPr>
+              <w:t>i</w:t>
+            </w:r>
+            <w:r>
+              <w:rPr>
+                <w:rFonts w:ascii="Times New Roman" w:hAnsi="Times New Roman" w:cs="Times New Roman"/>
+              </w:rPr>
+              <w:t>ty</w:t>
             </w:r>
           </w:p>
         </w:tc>
@@ -2360,7 +2688,8 @@
         </w:tc>
         <w:tc>
           <w:tcPr>
-            <w:tcW w:w="1870" w:type="dxa"/>
+            <w:tcW w:w="1761" w:type="dxa"/>
+            <w:shd w:val="clear" w:color="auto" w:fill="DAE9F7" w:themeFill="text2" w:themeFillTint="1A"/>
           </w:tcPr>
           <w:p>
             <w:pPr>
@@ -2395,7 +2724,8 @@
         </w:tc>
         <w:tc>
           <w:tcPr>
-            <w:tcW w:w="1733" w:type="dxa"/>
+            <w:tcW w:w="1842" w:type="dxa"/>
+            <w:shd w:val="clear" w:color="auto" w:fill="DAE9F7" w:themeFill="text2" w:themeFillTint="1A"/>
           </w:tcPr>
           <w:p>
             <w:pPr>
@@ -2527,7 +2857,8 @@
         </w:tc>
         <w:tc>
           <w:tcPr>
-            <w:tcW w:w="1870" w:type="dxa"/>
+            <w:tcW w:w="1761" w:type="dxa"/>
+            <w:shd w:val="clear" w:color="auto" w:fill="D9F2D0" w:themeFill="accent6" w:themeFillTint="33"/>
           </w:tcPr>
           <w:p>
             <w:pPr>
@@ -2562,7 +2893,8 @@
         </w:tc>
         <w:tc>
           <w:tcPr>
-            <w:tcW w:w="1733" w:type="dxa"/>
+            <w:tcW w:w="1842" w:type="dxa"/>
+            <w:shd w:val="clear" w:color="auto" w:fill="D9F2D0" w:themeFill="accent6" w:themeFillTint="33"/>
           </w:tcPr>
           <w:p>
             <w:pPr>
@@ -2818,64 +3150,210 @@
         </w:tc>
         <w:tc>
           <w:tcPr>
-            <w:tcW w:w="1870" w:type="dxa"/>
-          </w:tcPr>
-          <w:p>
-            <w:pPr>
-              <w:rPr>
-                <w:rFonts w:ascii="Times New Roman" w:hAnsi="Times New Roman" w:cs="Times New Roman"/>
-              </w:rPr>
-            </w:pPr>
-          </w:p>
-          <w:p>
-            <w:pPr>
-              <w:jc w:val="center"/>
-              <w:rPr>
-                <w:rFonts w:ascii="Times New Roman" w:hAnsi="Times New Roman" w:cs="Times New Roman"/>
-              </w:rPr>
-            </w:pPr>
-            <w:r>
-              <w:rPr>
-                <w:rFonts w:ascii="Times New Roman" w:hAnsi="Times New Roman" w:cs="Times New Roman"/>
-              </w:rPr>
-              <w:lastRenderedPageBreak/>
-              <w:t>Only database has date type ‘joined_date’ and boolean type ‘active_status’</w:t>
-            </w:r>
-          </w:p>
-          <w:p>
-            <w:pPr>
-              <w:rPr>
-                <w:rFonts w:ascii="Times New Roman" w:hAnsi="Times New Roman" w:cs="Times New Roman"/>
-              </w:rPr>
-            </w:pPr>
-          </w:p>
-        </w:tc>
-        <w:tc>
-          <w:tcPr>
-            <w:tcW w:w="1733" w:type="dxa"/>
-          </w:tcPr>
-          <w:p>
-            <w:pPr>
-              <w:jc w:val="center"/>
-              <w:rPr>
-                <w:rFonts w:ascii="Times New Roman" w:hAnsi="Times New Roman" w:cs="Times New Roman"/>
-              </w:rPr>
-            </w:pPr>
-          </w:p>
-          <w:p>
-            <w:pPr>
-              <w:jc w:val="center"/>
-              <w:rPr>
-                <w:rFonts w:ascii="Times New Roman" w:hAnsi="Times New Roman" w:cs="Times New Roman"/>
-              </w:rPr>
-            </w:pPr>
-            <w:r>
-              <w:rPr>
-                <w:rFonts w:ascii="Times New Roman" w:hAnsi="Times New Roman" w:cs="Times New Roman"/>
-              </w:rPr>
-              <w:lastRenderedPageBreak/>
-              <w:t>Create joined_date and active_status attributes in entity class</w:t>
-            </w:r>
+            <w:tcW w:w="1761" w:type="dxa"/>
+            <w:shd w:val="clear" w:color="auto" w:fill="DAE9F7" w:themeFill="text2" w:themeFillTint="1A"/>
+          </w:tcPr>
+          <w:p>
+            <w:pPr>
+              <w:rPr>
+                <w:rFonts w:ascii="Times New Roman" w:hAnsi="Times New Roman" w:cs="Times New Roman"/>
+              </w:rPr>
+            </w:pPr>
+          </w:p>
+          <w:p>
+            <w:pPr>
+              <w:jc w:val="center"/>
+              <w:rPr>
+                <w:rFonts w:ascii="Times New Roman" w:hAnsi="Times New Roman" w:cs="Times New Roman"/>
+              </w:rPr>
+            </w:pPr>
+            <w:r>
+              <w:rPr>
+                <w:rFonts w:ascii="Times New Roman" w:hAnsi="Times New Roman" w:cs="Times New Roman"/>
+              </w:rPr>
+              <w:t xml:space="preserve">Only database has </w:t>
+            </w:r>
+            <w:r>
+              <w:rPr>
+                <w:rFonts w:ascii="Times New Roman" w:hAnsi="Times New Roman" w:cs="Times New Roman"/>
+              </w:rPr>
+              <w:t>‘</w:t>
+            </w:r>
+            <w:r>
+              <w:rPr>
+                <w:rFonts w:ascii="Times New Roman" w:hAnsi="Times New Roman" w:cs="Times New Roman"/>
+              </w:rPr>
+              <w:t>date</w:t>
+            </w:r>
+            <w:r>
+              <w:rPr>
+                <w:rFonts w:ascii="Times New Roman" w:hAnsi="Times New Roman" w:cs="Times New Roman"/>
+              </w:rPr>
+              <w:t>’</w:t>
+            </w:r>
+            <w:r>
+              <w:rPr>
+                <w:rFonts w:ascii="Times New Roman" w:hAnsi="Times New Roman" w:cs="Times New Roman"/>
+              </w:rPr>
+              <w:t xml:space="preserve"> type ‘joined_date’ and </w:t>
+            </w:r>
+            <w:r>
+              <w:rPr>
+                <w:rFonts w:ascii="Times New Roman" w:hAnsi="Times New Roman" w:cs="Times New Roman"/>
+              </w:rPr>
+              <w:t>‘</w:t>
+            </w:r>
+            <w:r>
+              <w:rPr>
+                <w:rFonts w:ascii="Times New Roman" w:hAnsi="Times New Roman" w:cs="Times New Roman"/>
+              </w:rPr>
+              <w:t>boolean</w:t>
+            </w:r>
+            <w:r>
+              <w:rPr>
+                <w:rFonts w:ascii="Times New Roman" w:hAnsi="Times New Roman" w:cs="Times New Roman"/>
+              </w:rPr>
+              <w:t xml:space="preserve">’ </w:t>
+            </w:r>
+            <w:r>
+              <w:rPr>
+                <w:rFonts w:ascii="Times New Roman" w:hAnsi="Times New Roman" w:cs="Times New Roman"/>
+              </w:rPr>
+              <w:t>type ‘active_status’</w:t>
+            </w:r>
+          </w:p>
+          <w:p>
+            <w:pPr>
+              <w:rPr>
+                <w:rFonts w:ascii="Times New Roman" w:hAnsi="Times New Roman" w:cs="Times New Roman"/>
+              </w:rPr>
+            </w:pPr>
+          </w:p>
+        </w:tc>
+        <w:tc>
+          <w:tcPr>
+            <w:tcW w:w="1842" w:type="dxa"/>
+            <w:shd w:val="clear" w:color="auto" w:fill="DAE9F7" w:themeFill="text2" w:themeFillTint="1A"/>
+          </w:tcPr>
+          <w:p>
+            <w:pPr>
+              <w:jc w:val="center"/>
+              <w:rPr>
+                <w:rFonts w:ascii="Times New Roman" w:hAnsi="Times New Roman" w:cs="Times New Roman"/>
+              </w:rPr>
+            </w:pPr>
+          </w:p>
+          <w:p>
+            <w:pPr>
+              <w:jc w:val="center"/>
+              <w:rPr>
+                <w:rFonts w:ascii="Times New Roman" w:hAnsi="Times New Roman" w:cs="Times New Roman"/>
+              </w:rPr>
+            </w:pPr>
+            <w:r>
+              <w:rPr>
+                <w:rFonts w:ascii="Times New Roman" w:hAnsi="Times New Roman" w:cs="Times New Roman"/>
+              </w:rPr>
+              <w:t xml:space="preserve">Create </w:t>
+            </w:r>
+            <w:r>
+              <w:rPr>
+                <w:rFonts w:ascii="Times New Roman" w:hAnsi="Times New Roman" w:cs="Times New Roman"/>
+              </w:rPr>
+              <w:t xml:space="preserve">attributes of </w:t>
+            </w:r>
+            <w:r>
+              <w:rPr>
+                <w:rFonts w:ascii="Times New Roman" w:hAnsi="Times New Roman" w:cs="Times New Roman"/>
+              </w:rPr>
+              <w:t>‘</w:t>
+            </w:r>
+            <w:r>
+              <w:rPr>
+                <w:rFonts w:ascii="Times New Roman" w:hAnsi="Times New Roman" w:cs="Times New Roman"/>
+              </w:rPr>
+              <w:t>joined_date</w:t>
+            </w:r>
+            <w:r>
+              <w:rPr>
+                <w:rFonts w:ascii="Times New Roman" w:hAnsi="Times New Roman" w:cs="Times New Roman"/>
+              </w:rPr>
+              <w:t xml:space="preserve">’ </w:t>
+            </w:r>
+            <w:r>
+              <w:rPr>
+                <w:rFonts w:ascii="Times New Roman" w:hAnsi="Times New Roman" w:cs="Times New Roman"/>
+              </w:rPr>
+              <w:t xml:space="preserve">with </w:t>
+            </w:r>
+            <w:r>
+              <w:rPr>
+                <w:rFonts w:ascii="Times New Roman" w:hAnsi="Times New Roman" w:cs="Times New Roman"/>
+              </w:rPr>
+              <w:t xml:space="preserve">LocalDate </w:t>
+            </w:r>
+            <w:r>
+              <w:rPr>
+                <w:rFonts w:ascii="Times New Roman" w:hAnsi="Times New Roman" w:cs="Times New Roman"/>
+              </w:rPr>
+              <w:t xml:space="preserve">type </w:t>
+            </w:r>
+            <w:r>
+              <w:rPr>
+                <w:rFonts w:ascii="Times New Roman" w:hAnsi="Times New Roman" w:cs="Times New Roman"/>
+              </w:rPr>
+              <w:t xml:space="preserve">and </w:t>
+            </w:r>
+            <w:r>
+              <w:rPr>
+                <w:rFonts w:ascii="Times New Roman" w:hAnsi="Times New Roman" w:cs="Times New Roman"/>
+              </w:rPr>
+              <w:t>‘</w:t>
+            </w:r>
+            <w:r>
+              <w:rPr>
+                <w:rFonts w:ascii="Times New Roman" w:hAnsi="Times New Roman" w:cs="Times New Roman"/>
+              </w:rPr>
+              <w:t>active_status</w:t>
+            </w:r>
+            <w:r>
+              <w:rPr>
+                <w:rFonts w:ascii="Times New Roman" w:hAnsi="Times New Roman" w:cs="Times New Roman"/>
+              </w:rPr>
+              <w:t xml:space="preserve">’ </w:t>
+            </w:r>
+            <w:r>
+              <w:rPr>
+                <w:rFonts w:ascii="Times New Roman" w:hAnsi="Times New Roman" w:cs="Times New Roman"/>
+              </w:rPr>
+              <w:t xml:space="preserve">with </w:t>
+            </w:r>
+            <w:r>
+              <w:rPr>
+                <w:rFonts w:ascii="Times New Roman" w:hAnsi="Times New Roman" w:cs="Times New Roman"/>
+              </w:rPr>
+              <w:t xml:space="preserve">boolean </w:t>
+            </w:r>
+            <w:r>
+              <w:rPr>
+                <w:rFonts w:ascii="Times New Roman" w:hAnsi="Times New Roman" w:cs="Times New Roman"/>
+              </w:rPr>
+              <w:t xml:space="preserve">type </w:t>
+            </w:r>
+            <w:r>
+              <w:rPr>
+                <w:rFonts w:ascii="Times New Roman" w:hAnsi="Times New Roman" w:cs="Times New Roman"/>
+              </w:rPr>
+              <w:t>entity class</w:t>
+            </w:r>
+          </w:p>
+          <w:p>
+            <w:pPr>
+              <w:jc w:val="center"/>
+              <w:rPr>
+                <w:rFonts w:ascii="Times New Roman" w:hAnsi="Times New Roman" w:cs="Times New Roman"/>
+              </w:rPr>
+            </w:pPr>
           </w:p>
         </w:tc>
       </w:tr>
@@ -2953,7 +3431,8 @@
         </w:tc>
         <w:tc>
           <w:tcPr>
-            <w:tcW w:w="1870" w:type="dxa"/>
+            <w:tcW w:w="1761" w:type="dxa"/>
+            <w:shd w:val="clear" w:color="auto" w:fill="D9F2D0" w:themeFill="accent6" w:themeFillTint="33"/>
           </w:tcPr>
           <w:p>
             <w:pPr>
@@ -2988,8 +3467,17 @@
         </w:tc>
         <w:tc>
           <w:tcPr>
-            <w:tcW w:w="1733" w:type="dxa"/>
-          </w:tcPr>
+            <w:tcW w:w="1842" w:type="dxa"/>
+            <w:shd w:val="clear" w:color="auto" w:fill="D9F2D0" w:themeFill="accent6" w:themeFillTint="33"/>
+          </w:tcPr>
+          <w:p>
+            <w:pPr>
+              <w:jc w:val="center"/>
+              <w:rPr>
+                <w:rFonts w:ascii="Times New Roman" w:hAnsi="Times New Roman" w:cs="Times New Roman"/>
+              </w:rPr>
+            </w:pPr>
+          </w:p>
           <w:p>
             <w:pPr>
               <w:jc w:val="center"/>
@@ -3221,7 +3709,8 @@
         </w:tc>
         <w:tc>
           <w:tcPr>
-            <w:tcW w:w="1870" w:type="dxa"/>
+            <w:tcW w:w="1761" w:type="dxa"/>
+            <w:shd w:val="clear" w:color="auto" w:fill="DAE9F7" w:themeFill="text2" w:themeFillTint="1A"/>
           </w:tcPr>
           <w:p>
             <w:pPr>
@@ -3256,7 +3745,8 @@
         </w:tc>
         <w:tc>
           <w:tcPr>
-            <w:tcW w:w="1733" w:type="dxa"/>
+            <w:tcW w:w="1842" w:type="dxa"/>
+            <w:shd w:val="clear" w:color="auto" w:fill="DAE9F7" w:themeFill="text2" w:themeFillTint="1A"/>
           </w:tcPr>
           <w:p>
             <w:pPr>
@@ -3335,7 +3825,8 @@
         </w:tc>
         <w:tc>
           <w:tcPr>
-            <w:tcW w:w="1870" w:type="dxa"/>
+            <w:tcW w:w="1761" w:type="dxa"/>
+            <w:shd w:val="clear" w:color="auto" w:fill="D9F2D0" w:themeFill="accent6" w:themeFillTint="33"/>
           </w:tcPr>
           <w:p>
             <w:pPr>
@@ -3382,27 +3873,34 @@
         </w:tc>
         <w:tc>
           <w:tcPr>
-            <w:tcW w:w="1733" w:type="dxa"/>
-          </w:tcPr>
-          <w:p>
-            <w:pPr>
-              <w:rPr>
-                <w:rFonts w:ascii="Times New Roman" w:hAnsi="Times New Roman" w:cs="Times New Roman"/>
-              </w:rPr>
-            </w:pPr>
-          </w:p>
-          <w:p>
-            <w:pPr>
-              <w:jc w:val="center"/>
-              <w:rPr>
-                <w:rFonts w:ascii="Times New Roman" w:hAnsi="Times New Roman" w:cs="Times New Roman"/>
-              </w:rPr>
-            </w:pPr>
-            <w:r>
-              <w:rPr>
-                <w:rFonts w:ascii="Times New Roman" w:hAnsi="Times New Roman" w:cs="Times New Roman"/>
-              </w:rPr>
-              <w:t>Change data type of ‘points’ into int in database</w:t>
+            <w:tcW w:w="1842" w:type="dxa"/>
+            <w:shd w:val="clear" w:color="auto" w:fill="D9F2D0" w:themeFill="accent6" w:themeFillTint="33"/>
+          </w:tcPr>
+          <w:p>
+            <w:pPr>
+              <w:rPr>
+                <w:rFonts w:ascii="Times New Roman" w:hAnsi="Times New Roman" w:cs="Times New Roman"/>
+              </w:rPr>
+            </w:pPr>
+          </w:p>
+          <w:p>
+            <w:pPr>
+              <w:jc w:val="center"/>
+              <w:rPr>
+                <w:rFonts w:ascii="Times New Roman" w:hAnsi="Times New Roman" w:cs="Times New Roman"/>
+              </w:rPr>
+            </w:pPr>
+            <w:r>
+              <w:rPr>
+                <w:rFonts w:ascii="Times New Roman" w:hAnsi="Times New Roman" w:cs="Times New Roman"/>
+              </w:rPr>
+              <w:t xml:space="preserve">Change data type of ‘points’ into int in </w:t>
+            </w:r>
+            <w:r>
+              <w:rPr>
+                <w:rFonts w:ascii="Times New Roman" w:hAnsi="Times New Roman" w:cs="Times New Roman"/>
+              </w:rPr>
+              <w:t>students club table</w:t>
             </w:r>
           </w:p>
         </w:tc>

</xml_diff>